<commit_message>
Add neon redesign, QR entry, 12 tables, 60 tracks and VPS deployment docs
</commit_message>
<xml_diff>
--- a/docs/Encore_Пояснительная_записка.docx
+++ b/docs/Encore_Пояснительная_записка.docx
@@ -74,7 +74,7 @@
       <w:r>
         <w:t>Автор: Арсений Шохин</w:t>
         <w:br/>
-        <w:t>Версия проекта: 1.0, учебная реализация</w:t>
+        <w:t>Версия проекта: 2.0 / Neon, учебная реализация</w:t>
         <w:br/>
         <w:t>Дата подготовки: 8 октября 2026 года</w:t>
       </w:r>
@@ -157,7 +157,17 @@
     </w:p>
     <w:p>
       <w:r>
-        <w:t>12. Заключение и источники</w:t>
+        <w:t>12. Размещение на сервере</w:t>
+      </w:r>
+    </w:p>
+    <w:p>
+      <w:r>
+        <w:t>13. Возможные новые модули</w:t>
+      </w:r>
+    </w:p>
+    <w:p>
+      <w:r>
+        <w:t>14. Заключение и источники</w:t>
       </w:r>
     </w:p>
     <w:tbl>
@@ -489,7 +499,7 @@
     </w:p>
     <w:p>
       <w:r>
-        <w:t>Encore создаёт цифровой канал между залом и диджеем. Гость открывает ссылку своего столика, выбирает композицию и наблюдает за статусом заявки. Диджей сохраняет контроль над содержанием программы: подтверждает заявки, отклоняет неподходящие и запускает выступления.</w:t>
+        <w:t>Encore создаёт цифровой канал между залом и диджеем. Гость сканирует общий QR, выбирает столик и композицию и наблюдает за статусом заявки. Диджей сохраняет контроль над содержанием программы: подтверждает заявки, отклоняет неподходящие и запускает выступления.</w:t>
       </w:r>
     </w:p>
     <w:p>
@@ -518,7 +528,7 @@
         <w:pStyle w:val="ListBullet"/>
       </w:pPr>
       <w:r>
-        <w:t>Реализовать каталог с поиском и фильтрацией по жанру.</w:t>
+        <w:t>Реализовать каталог из 60 записей с поиском и жанрами; добавить QR входа и выбор из 12 столиков.</w:t>
       </w:r>
     </w:p>
     <w:p>
@@ -751,7 +761,7 @@
               <w:rPr>
                 <w:sz w:val="20"/>
               </w:rPr>
-              <w:t>Сеанс гостя, каталог, создание заявки и голосование.</w:t>
+              <w:t>QR входа, выбор из 12 столиков, каталог, заявка и голосование.</w:t>
             </w:r>
           </w:p>
         </w:tc>
@@ -825,7 +835,44 @@
               <w:rPr>
                 <w:sz w:val="20"/>
               </w:rPr>
-              <w:t>Общие модели, правила обработки, синхронизация и JSON-хранилище.</w:t>
+              <w:t>Общие модели, правила, миграция столиков и JSON-хранилище.</w:t>
+            </w:r>
+          </w:p>
+        </w:tc>
+      </w:tr>
+      <w:tr>
+        <w:trPr>
+          <w:cantSplit/>
+        </w:trPr>
+        <w:tc>
+          <w:tcPr>
+            <w:tcW w:type="dxa" w:w="4791"/>
+          </w:tcPr>
+          <w:p>
+            <w:pPr>
+              <w:spacing w:after="80"/>
+            </w:pPr>
+            <w:r>
+              <w:rPr>
+                <w:sz w:val="20"/>
+              </w:rPr>
+              <w:t>Core/TrackCatalog.cs</w:t>
+            </w:r>
+          </w:p>
+        </w:tc>
+        <w:tc>
+          <w:tcPr>
+            <w:tcW w:type="dxa" w:w="4791"/>
+          </w:tcPr>
+          <w:p>
+            <w:pPr>
+              <w:spacing w:after="80"/>
+            </w:pPr>
+            <w:r>
+              <w:rPr>
+                <w:sz w:val="20"/>
+              </w:rPr>
+              <w:t>60 записей каталога; справочные длительности.</w:t>
             </w:r>
           </w:p>
         </w:tc>
@@ -934,12 +981,12 @@
     </w:p>
     <w:p>
       <w:r>
-        <w:t>Модуль позволяет посетителю выбрать музыку и участвовать в общей программе без учётной записи. При первом запуске создаются восемь столиков с независимыми случайными 128-битными токенами. QR-код содержит адрес /table/{token}. Сервер проверяет токен, создаёт четырёхчасовой сеанс и записывает идентификатор в HttpOnly cookie.</w:t>
+        <w:t>Модуль позволяет посетителю выбрать музыку и участвовать в общей программе без учётной записи. При первом запуске создаются двенадцать столиков с независимыми случайными 128-битными токенами. QR-код содержит адрес /table/{token}. Сервер проверяет токен, создаёт четырёхчасовой сеанс и записывает идентификатор в HttpOnly cookie.</w:t>
       </w:r>
     </w:p>
     <w:p>
       <w:r>
-        <w:t>В режиме Development доступна кнопка подключения демонстрационного столика № 1. В Production этой возможности нет. Если сеанс истёк или сервер перезапущен, гость должен повторно открыть карточку столика.</w:t>
+        <w:t>При входе через общий QR или непосредственно на сайт открывается выбор из 12 столиков. Выбор работает и в Production; сервер проверяет существование номера и создаёт сеанс. Кнопка номера позволяет сменить столик. Индивидуальный QR подключает конкретный столик сразу. Если сеанс истёк или сервер перезапущен, гость должен повторно открыть карточку столика.</w:t>
       </w:r>
     </w:p>
     <w:p>
@@ -952,7 +999,7 @@
     </w:p>
     <w:p>
       <w:r>
-        <w:t>Каталог содержит 13 демонстрационных записей. По умолчанию доступны 11: композиция с признаком explicit и трек длиннее установленного максимума скрыты. Поиск выполняется без учёта регистра по названию и исполнителю, жанры переключаются отдельными кнопками.</w:t>
+        <w:t>Каталог содержит 60 демонстрационных записей. По умолчанию доступны 58: композиция с признаком explicit и трек длиннее установленного максимума скрыты. Поиск выполняется без учёта регистра по названию и исполнителю, жанры переключаются отдельными кнопками.</w:t>
       </w:r>
     </w:p>
     <w:tbl>
@@ -1292,7 +1339,7 @@
     </w:p>
     <w:p>
       <w:r>
-        <w:t>Дизайн основан на визуальном образе виниловой пластинки: тёплый светлый фон, крупные антиквенные заголовки, мягкие зелёные и персиковые акценты. Тёмная карточка очереди помогает отделить текущую программу от каталога. Обложки — авторские графические карточки с инициалами исполнителей, а не скопированные изображения альбомов.</w:t>
+        <w:t>Новая версия использует неоновый стиль: тёмный фон, лаймовый, розовый и фиолетовый акценты, светящиеся звуковые волны. На первом экране меньше текста: выбор столика, переход к каталогу и общий QR. Очередь выделена отдельной карточкой. Обложки — авторские графические карточки с инициалами исполнителей, а не скопированные изображения альбомов.</w:t>
       </w:r>
     </w:p>
     <w:p>
@@ -1342,7 +1389,75 @@
     </w:p>
     <w:p>
       <w:r>
-        <w:t>На телефоне блоки располагаются последовательно: приветствие, подключение столика, каталог, очередь. Для ширины 390 пикселей проверено отсутствие горизонтальной прокрутки. Поддерживается системное уменьшение анимации. Декоративная пластинка не означает воспроизведение аудио.</w:t>
+        <w:t>На телефоне блоки располагаются последовательно: короткое приветствие, выбор столика, каталог, очередь. Для ширины 390 пикселей проверено отсутствие горизонтальной прокрутки. Поддерживается системное уменьшение анимации. Декоративные звуковые волны не означают воспроизведение аудио.</w:t>
+      </w:r>
+    </w:p>
+    <w:p>
+      <w:r>
+        <w:br w:type="page"/>
+      </w:r>
+    </w:p>
+    <w:p>
+      <w:pPr>
+        <w:pStyle w:val="Heading1"/>
+      </w:pPr>
+      <w:r>
+        <w:t>4.1 Вход: QR и выбор столика</w:t>
+      </w:r>
+    </w:p>
+    <w:p>
+      <w:r>
+        <w:t>Общий QR открывает главную страницу сайта. При отсутствии сеанса предлагается выбрать один из 12 столиков. Номера проверяются сервером; успешный выбор создаёт четырёхчасовую гостевую сессию. Сменить столик можно кнопкой его номера.</w:t>
+      </w:r>
+    </w:p>
+    <w:p>
+      <w:r>
+        <w:drawing>
+          <wp:inline xmlns:a="http://schemas.openxmlformats.org/drawingml/2006/main" xmlns:pic="http://schemas.openxmlformats.org/drawingml/2006/picture">
+            <wp:extent cx="5940000" cy="3506250"/>
+            <wp:docPr id="3" name="Picture 3"/>
+            <wp:cNvGraphicFramePr>
+              <a:graphicFrameLocks noChangeAspect="1"/>
+            </wp:cNvGraphicFramePr>
+            <a:graphic>
+              <a:graphicData uri="http://schemas.openxmlformats.org/drawingml/2006/picture">
+                <pic:pic>
+                  <pic:nvPicPr>
+                    <pic:cNvPr id="0" name="report-table-selection.png"/>
+                    <pic:cNvPicPr/>
+                  </pic:nvPicPr>
+                  <pic:blipFill>
+                    <a:blip r:embed="rId13"/>
+                    <a:stretch>
+                      <a:fillRect/>
+                    </a:stretch>
+                  </pic:blipFill>
+                  <pic:spPr>
+                    <a:xfrm>
+                      <a:off x="0" y="0"/>
+                      <a:ext cx="5940000" cy="3506250"/>
+                    </a:xfrm>
+                    <a:prstGeom prst="rect"/>
+                  </pic:spPr>
+                </pic:pic>
+              </a:graphicData>
+            </a:graphic>
+          </wp:inline>
+        </w:drawing>
+      </w:r>
+    </w:p>
+    <w:p>
+      <w:pPr>
+        <w:pStyle w:val="Caption"/>
+        <w:jc w:val="center"/>
+      </w:pPr>
+      <w:r>
+        <w:t>Рисунок 3 — Выбор столика при входе</w:t>
+      </w:r>
+    </w:p>
+    <w:p>
+      <w:r>
+        <w:t>Кнопка «QR входа» показывает общий код и позволяет сохранить SVG для печати. Для телефона QR должен содержать опубликованный домен или адрес компьютера в общей сети. Декодирование сгенерированного QR проверено отдельно: получен адрес входа на сайт.</w:t>
       </w:r>
     </w:p>
     <w:p>
@@ -1701,7 +1816,7 @@
         <w:pStyle w:val="ListBullet"/>
       </w:pPr>
       <w:r>
-        <w:t>Ссылки и SVG QR-карточки для всех восьми столиков.</w:t>
+        <w:t>Ссылки и SVG QR-карточки для всех двенадцати столиков.</w:t>
       </w:r>
     </w:p>
     <w:p>
@@ -1732,7 +1847,7 @@
     </w:p>
     <w:p>
       <w:r>
-        <w:t>Пульт продолжает визуальную концепцию гостевого экрана, но построен вокруг рабочих действий. Зелёные кнопки обозначают разрешение и запуск, текстовые кнопки — отклонение и пропуск. Справа размещены настройки и карточки столиков. Формы показывают ошибки сервера вместо молчаливого отказа.</w:t>
+        <w:t>Пульт продолжает визуальную концепцию гостевого экрана, но построен вокруг рабочих действий. Лаймовые кнопки обозначают разрешение и запуск, текстовые кнопки — отклонение и пропуск. Справа размещены настройки и карточки столиков. Формы показывают ошибки сервера вместо молчаливого отказа.</w:t>
       </w:r>
     </w:p>
     <w:p>
@@ -1740,7 +1855,7 @@
         <w:drawing>
           <wp:inline xmlns:a="http://schemas.openxmlformats.org/drawingml/2006/main" xmlns:pic="http://schemas.openxmlformats.org/drawingml/2006/picture">
             <wp:extent cx="5940000" cy="4785000"/>
-            <wp:docPr id="3" name="Picture 3"/>
+            <wp:docPr id="4" name="Picture 4"/>
             <wp:cNvGraphicFramePr>
               <a:graphicFrameLocks noChangeAspect="1"/>
             </wp:cNvGraphicFramePr>
@@ -1752,7 +1867,7 @@
                     <pic:cNvPicPr/>
                   </pic:nvPicPr>
                   <pic:blipFill>
-                    <a:blip r:embed="rId13"/>
+                    <a:blip r:embed="rId14"/>
                     <a:stretch>
                       <a:fillRect/>
                     </a:stretch>
@@ -1777,7 +1892,7 @@
         <w:jc w:val="center"/>
       </w:pPr>
       <w:r>
-        <w:t>Рисунок 3 — Пульт диджея: модерация, текущее выступление и настройки</w:t>
+        <w:t>Рисунок 4 — Пульт диджея: модерация, текущее выступление и настройки</w:t>
       </w:r>
     </w:p>
     <w:p>
@@ -2098,7 +2213,7 @@
     </w:p>
     <w:p>
       <w:r>
-        <w:t>Рабочие данные располагаются в App_Data/state.json. Путь можно переопределить переменной ENCORE_DATA_DIR. После перезапуска столики и токены остаются прежними; заявки, голоса и настройки восстанавливаются. Гостевые сеансы и вход диджея нужно создать заново.</w:t>
+        <w:t>Рабочие данные располагаются в App_Data/state.json. Путь можно переопределить переменной ENCORE_DATA_DIR. После перезапуска столики и токены остаются прежними; заявки, голоса и настройки восстанавливаются. Гостевые сеансы нужно создать заново. Ключи cookie диджея теперь сохраняются в подкаталоге keys; вход действителен до срока действия cookie при сохранённых ключах.</w:t>
       </w:r>
     </w:p>
     <w:p>
@@ -2230,7 +2345,118 @@
               <w:rPr>
                 <w:sz w:val="20"/>
               </w:rPr>
-              <w:t>Создание гостевого сеанса и переход на сайт.</w:t>
+              <w:t>Подключение конкретного столика и переход на сайт.</w:t>
+            </w:r>
+          </w:p>
+        </w:tc>
+      </w:tr>
+      <w:tr>
+        <w:trPr>
+          <w:cantSplit/>
+        </w:trPr>
+        <w:tc>
+          <w:tcPr>
+            <w:tcW w:type="dxa" w:w="4791"/>
+          </w:tcPr>
+          <w:p>
+            <w:pPr>
+              <w:spacing w:after="80"/>
+            </w:pPr>
+            <w:r>
+              <w:rPr>
+                <w:sz w:val="20"/>
+              </w:rPr>
+              <w:t>GET /api/qr</w:t>
+            </w:r>
+          </w:p>
+        </w:tc>
+        <w:tc>
+          <w:tcPr>
+            <w:tcW w:type="dxa" w:w="4791"/>
+          </w:tcPr>
+          <w:p>
+            <w:pPr>
+              <w:spacing w:after="80"/>
+            </w:pPr>
+            <w:r>
+              <w:rPr>
+                <w:sz w:val="20"/>
+              </w:rPr>
+              <w:t>Общий QR: открывает сайт с выбором столика.</w:t>
+            </w:r>
+          </w:p>
+        </w:tc>
+      </w:tr>
+      <w:tr>
+        <w:trPr>
+          <w:cantSplit/>
+        </w:trPr>
+        <w:tc>
+          <w:tcPr>
+            <w:tcW w:type="dxa" w:w="4791"/>
+          </w:tcPr>
+          <w:p>
+            <w:pPr>
+              <w:spacing w:after="80"/>
+            </w:pPr>
+            <w:r>
+              <w:rPr>
+                <w:sz w:val="20"/>
+              </w:rPr>
+              <w:t>GET /api/tables</w:t>
+            </w:r>
+          </w:p>
+        </w:tc>
+        <w:tc>
+          <w:tcPr>
+            <w:tcW w:type="dxa" w:w="4791"/>
+          </w:tcPr>
+          <w:p>
+            <w:pPr>
+              <w:spacing w:after="80"/>
+            </w:pPr>
+            <w:r>
+              <w:rPr>
+                <w:sz w:val="20"/>
+              </w:rPr>
+              <w:t>Публичный список номеров столиков без токенов.</w:t>
+            </w:r>
+          </w:p>
+        </w:tc>
+      </w:tr>
+      <w:tr>
+        <w:trPr>
+          <w:cantSplit/>
+        </w:trPr>
+        <w:tc>
+          <w:tcPr>
+            <w:tcW w:type="dxa" w:w="4791"/>
+          </w:tcPr>
+          <w:p>
+            <w:pPr>
+              <w:spacing w:after="80"/>
+            </w:pPr>
+            <w:r>
+              <w:rPr>
+                <w:sz w:val="20"/>
+              </w:rPr>
+              <w:t>POST /api/guest/select</w:t>
+            </w:r>
+          </w:p>
+        </w:tc>
+        <w:tc>
+          <w:tcPr>
+            <w:tcW w:type="dxa" w:w="4791"/>
+          </w:tcPr>
+          <w:p>
+            <w:pPr>
+              <w:spacing w:after="80"/>
+            </w:pPr>
+            <w:r>
+              <w:rPr>
+                <w:sz w:val="20"/>
+              </w:rPr>
+              <w:t>Выбор столика, проверка номера и создание сеанса.</w:t>
             </w:r>
           </w:p>
         </w:tc>
@@ -2744,12 +2970,12 @@
     </w:p>
     <w:p>
       <w:r>
-        <w:t>Ссылка столика даёт доступ любому её обладателю и не доказывает физическое присутствие в ресторане. Гости одного столика разделяют права и лимиты. Учётные записи нескольких диджеев, смена пароля из интерфейса и автоматическая блокировка подозрительных столиков не реализованы.</w:t>
+        <w:t>Ссылка столика даёт доступ любому её обладателю и не доказывает физическое присутствие в ресторане. Гости одного столика разделяют права и лимиты. Выбор номера доступен любому гостю и не доказывает физическое присутствие. Учётные записи нескольких диджеев, смена пароля из интерфейса и автоматическая блокировка столиков не реализованы.</w:t>
       </w:r>
     </w:p>
     <w:p>
       <w:r>
-        <w:t>За reverse proxy необходимо отдельно корректно настроить доверенные forwarded headers и определение IP. В этой версии IP берётся из соединения сервера; за общим прокси несколько посетителей могут разделять один лимит.</w:t>
+        <w:t>В проект добавлена обработка forwarded headers от явно доверенного IP reverse proxy (ENCORE_TRUSTED_PROXY). В Docker Compose доверяется только Caddy. От неизвестного прокси заголовки не принимаются. При иной топологии адрес доверенного прокси нужно настроить отдельно.</w:t>
       </w:r>
     </w:p>
     <w:p>
@@ -2777,7 +3003,7 @@
     </w:p>
     <w:p>
       <w:r>
-        <w:t>Проверки выполнены на Linux с .NET SDK 8.0.425. Сборка dotnet build завершилась без ошибок и предупреждений. Интеграционный сценарий scripts/smoke.py выполнил 54 HTTP-проверки на отдельном сервере с временным хранилищем; рабочие данные им не затрагиваются.</w:t>
+        <w:t>Проверки выполнены на Linux с .NET SDK 8.0.425. Сборка dotnet build завершилась без ошибок и предупреждений. Интеграционный сценарий scripts/smoke.py выполнил 69 HTTP-проверки на отдельном сервере с временным хранилищем; рабочие данные им не затрагиваются.</w:t>
       </w:r>
     </w:p>
     <w:tbl>
@@ -2881,6 +3107,43 @@
               <w:rPr>
                 <w:sz w:val="20"/>
               </w:rPr>
+              <w:t>Production и reverse proxy</w:t>
+            </w:r>
+          </w:p>
+        </w:tc>
+        <w:tc>
+          <w:tcPr>
+            <w:tcW w:type="dxa" w:w="4791"/>
+          </w:tcPr>
+          <w:p>
+            <w:pPr>
+              <w:spacing w:after="80"/>
+            </w:pPr>
+            <w:r>
+              <w:rPr>
+                <w:sz w:val="20"/>
+              </w:rPr>
+              <w:t>Встроенный пароль и демо отключены; выбор столика работает; HTTPS от доверенного прокси даёт Secure-cookie.</w:t>
+            </w:r>
+          </w:p>
+        </w:tc>
+      </w:tr>
+      <w:tr>
+        <w:trPr>
+          <w:cantSplit/>
+        </w:trPr>
+        <w:tc>
+          <w:tcPr>
+            <w:tcW w:type="dxa" w:w="4791"/>
+          </w:tcPr>
+          <w:p>
+            <w:pPr>
+              <w:spacing w:after="80"/>
+            </w:pPr>
+            <w:r>
+              <w:rPr>
+                <w:sz w:val="20"/>
+              </w:rPr>
               <w:t>Гостевой сеанс</w:t>
             </w:r>
           </w:p>
@@ -2897,7 +3160,7 @@
               <w:rPr>
                 <w:sz w:val="20"/>
               </w:rPr>
-              <w:t>Демо-вход и валидная ссылка работают; неизвестный токен даёт 404.</w:t>
+              <w:t>Выбор номера и ссылка работают; неизвестные столик и токен дают 404.</w:t>
             </w:r>
           </w:p>
         </w:tc>
@@ -3193,7 +3456,7 @@
               <w:rPr>
                 <w:sz w:val="20"/>
               </w:rPr>
-              <w:t>После остановки и нового запуска восстановлены заявки, голоса и настройки.</w:t>
+              <w:t>После нового запуска восстановлены заявки, голоса и настройки; проверена миграция восьми столиков до двенадцати без изменения прежних токенов.</w:t>
             </w:r>
           </w:p>
         </w:tc>
@@ -3350,7 +3613,7 @@
     <w:p/>
     <w:p>
       <w:r>
-        <w:t>Автоматический таймер предусмотрен кодом; его истечение не входило в 54 HTTP-проверки. Также отдельно не проверялись истечение четырёхчасового сеанса, реальные мобильные камеры, Safari / Firefox, нагрузка, промышленное развёртывание и восстановление из резервной копии. Проверка перезапуска подтверждает сохранение состояния, но не заменяет проверку резервного копирования.</w:t>
+        <w:t>Автоматический таймер предусмотрен кодом; его истечение не входило в 69 HTTP-проверки. Также отдельно не проверялись истечение четырёхчасового сеанса, реальные мобильные камеры, Safari / Firefox, нагрузка, промышленное развёртывание и восстановление из резервной копии. Проверка перезапуска подтверждает сохранение состояния, но не заменяет проверку резервного копирования.</w:t>
       </w:r>
     </w:p>
     <w:p>
@@ -3376,7 +3639,7 @@
     </w:p>
     <w:p>
       <w:r>
-        <w:t>Установите .NET SDK 8.0.425 либо совместимую более новую patch-версию. Распакуйте проект и откройте терминал в каталоге Encore.csproj. Выполните команды:</w:t>
+        <w:t>Используйте .NET SDK 8.0.425 или новее. global.json разрешает новые major-версии SDK; Directory.Build.props разрешает roll-forward runtime. Комплект проверен на .NET 8.0.425. Распакуйте проект и откройте терминал в каталоге Encore.csproj. Выполните команды:</w:t>
       </w:r>
     </w:p>
     <w:p>
@@ -3421,7 +3684,7 @@
     </w:p>
     <w:p>
       <w:r>
-        <w:t>1. Откройте сайт, подключите демонстрационный столик № 1.</w:t>
+        <w:t>1. Откройте сайт через QR или ссылку и выберите один из 12 столиков.</w:t>
       </w:r>
     </w:p>
     <w:p>
@@ -3487,17 +3750,427 @@
         <w:pStyle w:val="Heading1"/>
       </w:pPr>
       <w:r>
-        <w:t>12. Заключение и источники</w:t>
+        <w:t>12. Размещение на сервере</w:t>
       </w:r>
     </w:p>
     <w:p>
       <w:r>
-        <w:t>Создано веб-приложение Encore на C# с двумя функциональными модулями. Гостевой модуль объединяет доступ по карточке столика, каталог, заявки, голосование и просмотр очереди. Пульт диджея объединяет авторизацию, модерацию, управление выступлениями, настройки и отчёт.</w:t>
+        <w:t>Для постоянного доступа нужен VPS с Ubuntu, установленный Docker Compose и собственный домен. DNS A-запись домена должна указывать на IP сервера; TCP-порты 80 и 443 должны быть доступны. Подготовлены Dockerfile, compose.yaml и deploy/Caddyfile. Caddy получает HTTPS-сертификат после настройки домена.</w:t>
       </w:r>
     </w:p>
     <w:p>
       <w:r>
-        <w:t>Дополнения к пользовательскому замыслу: выразительный дизайн в стилистике винила, адаптивные экраны, коллективное голосование по столикам, переключаемое название программы, оценка ожидания по длительностям, QR-карточки и самостоятельный API-сценарий проверки.</w:t>
+        <w:rPr>
+          <w:rFonts w:ascii="Consolas" w:hAnsi="Consolas"/>
+          <w:sz w:val="20"/>
+        </w:rPr>
+        <w:t>git clone https://github.com/Fear2281/fear.git</w:t>
+      </w:r>
+    </w:p>
+    <w:p>
+      <w:r>
+        <w:rPr>
+          <w:rFonts w:ascii="Consolas" w:hAnsi="Consolas"/>
+          <w:sz w:val="20"/>
+        </w:rPr>
+        <w:t>cd fear</w:t>
+      </w:r>
+    </w:p>
+    <w:p>
+      <w:r>
+        <w:rPr>
+          <w:rFonts w:ascii="Consolas" w:hAnsi="Consolas"/>
+          <w:sz w:val="20"/>
+        </w:rPr>
+        <w:t>cp .env.example .env</w:t>
+      </w:r>
+    </w:p>
+    <w:p>
+      <w:r>
+        <w:rPr>
+          <w:rFonts w:ascii="Consolas" w:hAnsi="Consolas"/>
+          <w:sz w:val="20"/>
+        </w:rPr>
+        <w:t>nano .env</w:t>
+      </w:r>
+    </w:p>
+    <w:p>
+      <w:r>
+        <w:rPr>
+          <w:rFonts w:ascii="Consolas" w:hAnsi="Consolas"/>
+          <w:sz w:val="20"/>
+        </w:rPr>
+        <w:t>docker compose up -d --build</w:t>
+      </w:r>
+    </w:p>
+    <w:p>
+      <w:r>
+        <w:t>В .env необходимо задать DOMAIN (домен без схемы) и ENCORE_DJ_PASSWORD (собственный пароль). Настоящие секреты не входят в Git. ENCORE_PUBLIC_URL формируется из домена автоматически. После запуска проверить /api/health, каталог, выбор столика, пароль пульта и QR с телефона.</w:t>
+      </w:r>
+    </w:p>
+    <w:p>
+      <w:r>
+        <w:t>Данные и ключи авторизации сохраняются в Docker volume. Reverse proxy имеет фиксированный доверенный IP. Запускается один экземпляр приложения; отдельный процесс Node.js не нужен. .NET находится внутри контейнера и не требует установки на VPS.</w:t>
+      </w:r>
+    </w:p>
+    <w:p>
+      <w:r>
+        <w:t>Compose-конфигурация проверена на корректность, Release-publish выполнен. Полная контейнерная сборка в этой облачной среде заблокирована сетевой политикой для загрузочного домена Microsoft; контейнер не был запущен. Полная пошаговая инструкция, обновление и ручной бэкап: deploy/SERVER.md. Реальное размещение на сервере пользователя, публичный сертификат и сканирование физической камерой не могут считаться выполненными до настройки этого сервера.</w:t>
+      </w:r>
+    </w:p>
+    <w:p>
+      <w:r>
+        <w:br w:type="page"/>
+      </w:r>
+    </w:p>
+    <w:p>
+      <w:pPr>
+        <w:pStyle w:val="Heading1"/>
+      </w:pPr>
+      <w:r>
+        <w:t>13. Возможные новые модули</w:t>
+      </w:r>
+    </w:p>
+    <w:p>
+      <w:r>
+        <w:t>Текущая реализация содержит ровно два функциональных модуля. Следующие идеи описывают будущую работу, а не готовые возможности.</w:t>
+      </w:r>
+    </w:p>
+    <w:tbl>
+      <w:tblPr>
+        <w:tblStyle w:val="LightShading-Accent1"/>
+        <w:tblW w:type="auto" w:w="0"/>
+        <w:tblLook w:firstColumn="1" w:firstRow="1" w:lastColumn="0" w:lastRow="0" w:noHBand="0" w:noVBand="1" w:val="04A0"/>
+      </w:tblPr>
+      <w:tblGrid>
+        <w:gridCol w:w="4791"/>
+        <w:gridCol w:w="4791"/>
+      </w:tblGrid>
+      <w:tr>
+        <w:trPr>
+          <w:tblHeader/>
+          <w:cantSplit/>
+        </w:trPr>
+        <w:tc>
+          <w:tcPr>
+            <w:tcW w:type="dxa" w:w="4791"/>
+          </w:tcPr>
+          <w:p>
+            <w:pPr>
+              <w:spacing w:after="80"/>
+            </w:pPr>
+            <w:r>
+              <w:rPr>
+                <w:sz w:val="20"/>
+              </w:rPr>
+              <w:t>Будущий модуль</w:t>
+            </w:r>
+          </w:p>
+        </w:tc>
+        <w:tc>
+          <w:tcPr>
+            <w:tcW w:type="dxa" w:w="4791"/>
+          </w:tcPr>
+          <w:p>
+            <w:pPr>
+              <w:spacing w:after="80"/>
+            </w:pPr>
+            <w:r>
+              <w:rPr>
+                <w:sz w:val="20"/>
+              </w:rPr>
+              <w:t>Возможности</w:t>
+            </w:r>
+          </w:p>
+        </w:tc>
+      </w:tr>
+      <w:tr>
+        <w:trPr>
+          <w:cantSplit/>
+        </w:trPr>
+        <w:tc>
+          <w:tcPr>
+            <w:tcW w:type="dxa" w:w="4791"/>
+          </w:tcPr>
+          <w:p>
+            <w:pPr>
+              <w:spacing w:after="80"/>
+            </w:pPr>
+            <w:r>
+              <w:rPr>
+                <w:sz w:val="20"/>
+              </w:rPr>
+              <w:t>Администрирование</w:t>
+            </w:r>
+          </w:p>
+        </w:tc>
+        <w:tc>
+          <w:tcPr>
+            <w:tcW w:type="dxa" w:w="4791"/>
+          </w:tcPr>
+          <w:p>
+            <w:pPr>
+              <w:spacing w:after="80"/>
+            </w:pPr>
+            <w:r>
+              <w:rPr>
+                <w:sz w:val="20"/>
+              </w:rPr>
+              <w:t>CRUD каталога, сотрудники и роли, управление столиками, журнал действий.</w:t>
+            </w:r>
+          </w:p>
+        </w:tc>
+      </w:tr>
+      <w:tr>
+        <w:trPr>
+          <w:cantSplit/>
+        </w:trPr>
+        <w:tc>
+          <w:tcPr>
+            <w:tcW w:type="dxa" w:w="4791"/>
+          </w:tcPr>
+          <w:p>
+            <w:pPr>
+              <w:spacing w:after="80"/>
+            </w:pPr>
+            <w:r>
+              <w:rPr>
+                <w:sz w:val="20"/>
+              </w:rPr>
+              <w:t>Музыкальный проигрыватель</w:t>
+            </w:r>
+          </w:p>
+        </w:tc>
+        <w:tc>
+          <w:tcPr>
+            <w:tcW w:type="dxa" w:w="4791"/>
+          </w:tcPr>
+          <w:p>
+            <w:pPr>
+              <w:spacing w:after="80"/>
+            </w:pPr>
+            <w:r>
+              <w:rPr>
+                <w:sz w:val="20"/>
+              </w:rPr>
+              <w:t>Лицензированные фонограммы, тексты караоке, синхронизация и громкость.</w:t>
+            </w:r>
+          </w:p>
+        </w:tc>
+      </w:tr>
+      <w:tr>
+        <w:trPr>
+          <w:cantSplit/>
+        </w:trPr>
+        <w:tc>
+          <w:tcPr>
+            <w:tcW w:type="dxa" w:w="4791"/>
+          </w:tcPr>
+          <w:p>
+            <w:pPr>
+              <w:spacing w:after="80"/>
+            </w:pPr>
+            <w:r>
+              <w:rPr>
+                <w:sz w:val="20"/>
+              </w:rPr>
+              <w:t>Аналитика</w:t>
+            </w:r>
+          </w:p>
+        </w:tc>
+        <w:tc>
+          <w:tcPr>
+            <w:tcW w:type="dxa" w:w="4791"/>
+          </w:tcPr>
+          <w:p>
+            <w:pPr>
+              <w:spacing w:after="80"/>
+            </w:pPr>
+            <w:r>
+              <w:rPr>
+                <w:sz w:val="20"/>
+              </w:rPr>
+              <w:t>Популярные композиции, активность залов и столиков, графики.</w:t>
+            </w:r>
+          </w:p>
+        </w:tc>
+      </w:tr>
+      <w:tr>
+        <w:trPr>
+          <w:cantSplit/>
+        </w:trPr>
+        <w:tc>
+          <w:tcPr>
+            <w:tcW w:type="dxa" w:w="4791"/>
+          </w:tcPr>
+          <w:p>
+            <w:pPr>
+              <w:spacing w:after="80"/>
+            </w:pPr>
+            <w:r>
+              <w:rPr>
+                <w:sz w:val="20"/>
+              </w:rPr>
+              <w:t>Бронирование</w:t>
+            </w:r>
+          </w:p>
+        </w:tc>
+        <w:tc>
+          <w:tcPr>
+            <w:tcW w:type="dxa" w:w="4791"/>
+          </w:tcPr>
+          <w:p>
+            <w:pPr>
+              <w:spacing w:after="80"/>
+            </w:pPr>
+            <w:r>
+              <w:rPr>
+                <w:sz w:val="20"/>
+              </w:rPr>
+              <w:t>Расписание караоке-комнат и бронь столиков, уведомления.</w:t>
+            </w:r>
+          </w:p>
+        </w:tc>
+      </w:tr>
+      <w:tr>
+        <w:trPr>
+          <w:cantSplit/>
+        </w:trPr>
+        <w:tc>
+          <w:tcPr>
+            <w:tcW w:type="dxa" w:w="4791"/>
+          </w:tcPr>
+          <w:p>
+            <w:pPr>
+              <w:spacing w:after="80"/>
+            </w:pPr>
+            <w:r>
+              <w:rPr>
+                <w:sz w:val="20"/>
+              </w:rPr>
+              <w:t>Лояльность</w:t>
+            </w:r>
+          </w:p>
+        </w:tc>
+        <w:tc>
+          <w:tcPr>
+            <w:tcW w:type="dxa" w:w="4791"/>
+          </w:tcPr>
+          <w:p>
+            <w:pPr>
+              <w:spacing w:after="80"/>
+            </w:pPr>
+            <w:r>
+              <w:rPr>
+                <w:sz w:val="20"/>
+              </w:rPr>
+              <w:t>Баллы, награды, любимые песни и рекомендации.</w:t>
+            </w:r>
+          </w:p>
+        </w:tc>
+      </w:tr>
+      <w:tr>
+        <w:trPr>
+          <w:cantSplit/>
+        </w:trPr>
+        <w:tc>
+          <w:tcPr>
+            <w:tcW w:type="dxa" w:w="4791"/>
+          </w:tcPr>
+          <w:p>
+            <w:pPr>
+              <w:spacing w:after="80"/>
+            </w:pPr>
+            <w:r>
+              <w:rPr>
+                <w:sz w:val="20"/>
+              </w:rPr>
+              <w:t>Оплата</w:t>
+            </w:r>
+          </w:p>
+        </w:tc>
+        <w:tc>
+          <w:tcPr>
+            <w:tcW w:type="dxa" w:w="4791"/>
+          </w:tcPr>
+          <w:p>
+            <w:pPr>
+              <w:spacing w:after="80"/>
+            </w:pPr>
+            <w:r>
+              <w:rPr>
+                <w:sz w:val="20"/>
+              </w:rPr>
+              <w:t>Оплата музыкального слота, интеграция провайдера, чеки и возвраты.</w:t>
+            </w:r>
+          </w:p>
+        </w:tc>
+      </w:tr>
+      <w:tr>
+        <w:trPr>
+          <w:cantSplit/>
+        </w:trPr>
+        <w:tc>
+          <w:tcPr>
+            <w:tcW w:type="dxa" w:w="4791"/>
+          </w:tcPr>
+          <w:p>
+            <w:pPr>
+              <w:spacing w:after="80"/>
+            </w:pPr>
+            <w:r>
+              <w:rPr>
+                <w:sz w:val="20"/>
+              </w:rPr>
+              <w:t>Экран зала</w:t>
+            </w:r>
+          </w:p>
+        </w:tc>
+        <w:tc>
+          <w:tcPr>
+            <w:tcW w:type="dxa" w:w="4791"/>
+          </w:tcPr>
+          <w:p>
+            <w:pPr>
+              <w:spacing w:after="80"/>
+            </w:pPr>
+            <w:r>
+              <w:rPr>
+                <w:sz w:val="20"/>
+              </w:rPr>
+              <w:t>Очередь на телевизоре, таймер, название трека, QR входа.</w:t>
+            </w:r>
+          </w:p>
+        </w:tc>
+      </w:tr>
+    </w:tbl>
+    <w:p/>
+    <w:p>
+      <w:r>
+        <w:t>Рекомендуемый следующий этап — база данных и администрирование, затем проигрыватель и экран зала. Подробные зависимости приведены в docs/FUTURE_MODULES.md. Добавление этих модулей потребует отдельного проектирования и тестирования.</w:t>
+      </w:r>
+    </w:p>
+    <w:p>
+      <w:r>
+        <w:br w:type="page"/>
+      </w:r>
+    </w:p>
+    <w:p>
+      <w:pPr>
+        <w:pStyle w:val="Heading1"/>
+      </w:pPr>
+      <w:r>
+        <w:t>14. Заключение и источники</w:t>
+      </w:r>
+    </w:p>
+    <w:p>
+      <w:r>
+        <w:t>Создано веб-приложение Encore на C# с двумя функциональными модулями. Гостевой модуль объединяет общий QR, выбор из 12 столиков, каталог, заявки, голосование и просмотр очереди. Пульт диджея объединяет авторизацию, модерацию, управление выступлениями, настройки и отчёт.</w:t>
+      </w:r>
+    </w:p>
+    <w:p>
+      <w:r>
+        <w:t>Дополнения к пользовательскому замыслу: яркий неоновый дизайн с короткими подписями, адаптивные экраны, коллективное голосование по столикам, переключаемое название программы, оценка ожидания по длительностям, QR-карточки и самостоятельный API-сценарий проверки.</w:t>
       </w:r>
     </w:p>
     <w:p>

</xml_diff>